<commit_message>
DONE:I have completed the data import, cleaning, and preprocessing. FEAT: I created the prediction using Prophet in a modularized way, allowing it to be applied to any result, with configurable risk limits and time horizons.
</commit_message>
<xml_diff>
--- a/source/doc/Project_FinancialApps..docx
+++ b/source/doc/Project_FinancialApps..docx
@@ -122,6 +122,7 @@
       </w:pPr>
       <w:r>
         <w:rPr>
+          <w:noProof/>
           <w:lang w:val="pt-BR"/>
         </w:rPr>
         <w:drawing>
@@ -140,7 +141,7 @@
                     <pic:cNvPicPr/>
                   </pic:nvPicPr>
                   <pic:blipFill>
-                    <a:blip r:embed="rId5"/>
+                    <a:blip r:embed="rId7"/>
                     <a:stretch>
                       <a:fillRect/>
                     </a:stretch>
@@ -494,7 +495,6 @@
         </w:rPr>
         <w:t xml:space="preserve">The </w:t>
       </w:r>
-      <w:proofErr w:type="gramStart"/>
       <w:r>
         <w:rPr>
           <w:rFonts w:ascii="Calibri" w:eastAsia="Calibri" w:hAnsi="Calibri" w:cs="Calibri"/>
@@ -509,16 +509,7 @@
           <w:sz w:val="20"/>
           <w:szCs w:val="20"/>
         </w:rPr>
-        <w:t xml:space="preserve"> of</w:t>
-      </w:r>
-      <w:proofErr w:type="gramEnd"/>
-      <w:r>
-        <w:rPr>
-          <w:rFonts w:ascii="Calibri" w:eastAsia="Calibri" w:hAnsi="Calibri" w:cs="Calibri"/>
-          <w:sz w:val="20"/>
-          <w:szCs w:val="20"/>
-        </w:rPr>
-        <w:t xml:space="preserve"> this project is to design and implement a financial forecasting system tailored to micro and small businesses, aiming to improve cash flow visibility and strategic decision-making. The solution integrates the following components</w:t>
+        <w:t xml:space="preserve"> of this project is to design and implement a financial forecasting system tailored to micro and small businesses, aiming to improve cash flow visibility and strategic decision-making. The solution integrates the following components</w:t>
       </w:r>
       <w:r>
         <w:rPr>
@@ -566,13 +557,15 @@
           <w:rFonts w:ascii="Calibri" w:eastAsia="Calibri" w:hAnsi="Calibri" w:cs="Calibri"/>
           <w:sz w:val="20"/>
           <w:szCs w:val="20"/>
-        </w:rPr>
-      </w:pPr>
-      <w:r>
-        <w:rPr>
-          <w:rFonts w:ascii="Calibri" w:eastAsia="Calibri" w:hAnsi="Calibri" w:cs="Calibri"/>
-          <w:sz w:val="20"/>
-          <w:szCs w:val="20"/>
+          <w:lang w:val="pt-BR"/>
+        </w:rPr>
+      </w:pPr>
+      <w:r>
+        <w:rPr>
+          <w:rFonts w:ascii="Calibri" w:eastAsia="Calibri" w:hAnsi="Calibri" w:cs="Calibri"/>
+          <w:sz w:val="20"/>
+          <w:szCs w:val="20"/>
+          <w:lang w:val="pt-BR"/>
         </w:rPr>
         <w:t>2.</w:t>
       </w:r>
@@ -581,16 +574,38 @@
           <w:rFonts w:ascii="Calibri" w:eastAsia="Calibri" w:hAnsi="Calibri" w:cs="Calibri"/>
           <w:sz w:val="20"/>
           <w:szCs w:val="20"/>
-        </w:rPr>
-        <w:t xml:space="preserve"> Database: </w:t>
-      </w:r>
-    </w:p>
-    <w:p>
-      <w:pPr>
-        <w:rPr>
-          <w:rFonts w:ascii="Calibri" w:eastAsia="Calibri" w:hAnsi="Calibri" w:cs="Calibri"/>
-          <w:sz w:val="20"/>
-          <w:szCs w:val="20"/>
+          <w:lang w:val="pt-BR"/>
+        </w:rPr>
+        <w:t xml:space="preserve"> </w:t>
+      </w:r>
+      <w:proofErr w:type="spellStart"/>
+      <w:r>
+        <w:rPr>
+          <w:rFonts w:ascii="Calibri" w:eastAsia="Calibri" w:hAnsi="Calibri" w:cs="Calibri"/>
+          <w:sz w:val="20"/>
+          <w:szCs w:val="20"/>
+          <w:lang w:val="pt-BR"/>
+        </w:rPr>
+        <w:t>Database</w:t>
+      </w:r>
+      <w:proofErr w:type="spellEnd"/>
+      <w:r>
+        <w:rPr>
+          <w:rFonts w:ascii="Calibri" w:eastAsia="Calibri" w:hAnsi="Calibri" w:cs="Calibri"/>
+          <w:sz w:val="20"/>
+          <w:szCs w:val="20"/>
+          <w:lang w:val="pt-BR"/>
+        </w:rPr>
+        <w:t xml:space="preserve">: </w:t>
+      </w:r>
+    </w:p>
+    <w:p>
+      <w:pPr>
+        <w:rPr>
+          <w:rFonts w:ascii="Calibri" w:eastAsia="Calibri" w:hAnsi="Calibri" w:cs="Calibri"/>
+          <w:sz w:val="20"/>
+          <w:szCs w:val="20"/>
+          <w:lang w:val="pt-BR"/>
         </w:rPr>
       </w:pPr>
     </w:p>
@@ -619,27 +634,7 @@
           <w:szCs w:val="20"/>
           <w:lang w:val="pt-BR"/>
         </w:rPr>
-        <w:t xml:space="preserve">eses para analisar e transformar os dados como os dados, veio de uma forma bruta, tive que </w:t>
-      </w:r>
-      <w:proofErr w:type="gramStart"/>
-      <w:r>
-        <w:rPr>
-          <w:rFonts w:ascii="Calibri" w:eastAsia="Calibri" w:hAnsi="Calibri" w:cs="Calibri"/>
-          <w:sz w:val="20"/>
-          <w:szCs w:val="20"/>
-          <w:lang w:val="pt-BR"/>
-        </w:rPr>
-        <w:t>inclui</w:t>
-      </w:r>
-      <w:proofErr w:type="gramEnd"/>
-      <w:r>
-        <w:rPr>
-          <w:rFonts w:ascii="Calibri" w:eastAsia="Calibri" w:hAnsi="Calibri" w:cs="Calibri"/>
-          <w:sz w:val="20"/>
-          <w:szCs w:val="20"/>
-          <w:lang w:val="pt-BR"/>
-        </w:rPr>
-        <w:t xml:space="preserve"> algumas colunas para </w:t>
+        <w:t xml:space="preserve">eses para analisar e transformar os dados como os dados, veio de uma forma bruta, tive que inclui algumas colunas para </w:t>
       </w:r>
       <w:r>
         <w:rPr>
@@ -691,6 +686,7 @@
       <w:r>
         <w:rPr>
           <w:rFonts w:ascii="Calibri" w:eastAsia="Calibri" w:hAnsi="Calibri" w:cs="Calibri"/>
+          <w:noProof/>
           <w:sz w:val="20"/>
           <w:szCs w:val="20"/>
           <w:lang w:val="pt-BR"/>
@@ -711,7 +707,7 @@
                     <pic:cNvPicPr/>
                   </pic:nvPicPr>
                   <pic:blipFill>
-                    <a:blip r:embed="rId6"/>
+                    <a:blip r:embed="rId8"/>
                     <a:stretch>
                       <a:fillRect/>
                     </a:stretch>
@@ -796,6 +792,7 @@
       <w:r>
         <w:rPr>
           <w:rFonts w:ascii="Calibri" w:eastAsia="Calibri" w:hAnsi="Calibri" w:cs="Calibri"/>
+          <w:noProof/>
           <w:sz w:val="20"/>
           <w:szCs w:val="20"/>
           <w:lang w:val="pt-BR"/>
@@ -816,7 +813,7 @@
                     <pic:cNvPicPr/>
                   </pic:nvPicPr>
                   <pic:blipFill>
-                    <a:blip r:embed="rId7"/>
+                    <a:blip r:embed="rId9"/>
                     <a:stretch>
                       <a:fillRect/>
                     </a:stretch>
@@ -900,7 +897,6 @@
         <w:t xml:space="preserve">que possamos supervisionar as versões do projeto no </w:t>
       </w:r>
       <w:proofErr w:type="spellStart"/>
-      <w:proofErr w:type="gramStart"/>
       <w:r>
         <w:rPr>
           <w:rFonts w:ascii="Calibri" w:eastAsia="Calibri" w:hAnsi="Calibri" w:cs="Calibri"/>
@@ -918,27 +914,7 @@
           <w:szCs w:val="20"/>
           <w:lang w:val="pt-BR"/>
         </w:rPr>
-        <w:t xml:space="preserve">  e</w:t>
-      </w:r>
-      <w:proofErr w:type="gramEnd"/>
-      <w:r>
-        <w:rPr>
-          <w:rFonts w:ascii="Calibri" w:eastAsia="Calibri" w:hAnsi="Calibri" w:cs="Calibri"/>
-          <w:sz w:val="20"/>
-          <w:szCs w:val="20"/>
-          <w:lang w:val="pt-BR"/>
-        </w:rPr>
-        <w:t xml:space="preserve"> Criamos um Dicionário de </w:t>
-      </w:r>
-      <w:proofErr w:type="gramStart"/>
-      <w:r>
-        <w:rPr>
-          <w:rFonts w:ascii="Calibri" w:eastAsia="Calibri" w:hAnsi="Calibri" w:cs="Calibri"/>
-          <w:sz w:val="20"/>
-          <w:szCs w:val="20"/>
-          <w:lang w:val="pt-BR"/>
-        </w:rPr>
-        <w:t xml:space="preserve">Dados </w:t>
+        <w:t xml:space="preserve">  e Criamos um Dicionário de Dados </w:t>
       </w:r>
       <w:r>
         <w:rPr>
@@ -948,17 +924,7 @@
           <w:lang w:val="pt-BR"/>
         </w:rPr>
         <w:lastRenderedPageBreak/>
-        <w:t>.</w:t>
-      </w:r>
-      <w:proofErr w:type="gramEnd"/>
-      <w:r>
-        <w:rPr>
-          <w:rFonts w:ascii="Calibri" w:eastAsia="Calibri" w:hAnsi="Calibri" w:cs="Calibri"/>
-          <w:sz w:val="20"/>
-          <w:szCs w:val="20"/>
-          <w:lang w:val="pt-BR"/>
-        </w:rPr>
-        <w:t xml:space="preserve"> </w:t>
+        <w:t xml:space="preserve">. </w:t>
       </w:r>
     </w:p>
     <w:p>
@@ -975,6 +941,7 @@
       <w:r>
         <w:rPr>
           <w:rFonts w:ascii="Calibri" w:eastAsia="Calibri" w:hAnsi="Calibri" w:cs="Calibri"/>
+          <w:noProof/>
           <w:sz w:val="20"/>
           <w:szCs w:val="20"/>
           <w:lang w:val="pt-BR"/>
@@ -995,7 +962,7 @@
                     <pic:cNvPicPr/>
                   </pic:nvPicPr>
                   <pic:blipFill>
-                    <a:blip r:embed="rId8"/>
+                    <a:blip r:embed="rId10"/>
                     <a:stretch>
                       <a:fillRect/>
                     </a:stretch>
@@ -1032,12 +999,6 @@
       <w:pPr>
         <w:pStyle w:val="PargrafodaLista"/>
         <w:ind w:left="586"/>
-        <w:rPr>
-          <w:rFonts w:ascii="Calibri" w:eastAsia="Calibri" w:hAnsi="Calibri" w:cs="Calibri"/>
-          <w:sz w:val="20"/>
-          <w:szCs w:val="20"/>
-          <w:lang w:val="pt-BR"/>
-        </w:rPr>
       </w:pPr>
       <w:r>
         <w:rPr>
@@ -1048,7 +1009,7 @@
         </w:rPr>
         <w:t xml:space="preserve">Link do Github:  </w:t>
       </w:r>
-      <w:hyperlink r:id="rId9" w:history="1">
+      <w:hyperlink r:id="rId11" w:history="1">
         <w:r>
           <w:rPr>
             <w:rStyle w:val="Hyperlink"/>
@@ -1084,6 +1045,34 @@
           <w:rFonts w:ascii="Calibri" w:eastAsia="Calibri" w:hAnsi="Calibri" w:cs="Calibri"/>
           <w:sz w:val="20"/>
           <w:szCs w:val="20"/>
+        </w:rPr>
+      </w:pPr>
+      <w:r>
+        <w:t xml:space="preserve">A project architecture was designed to guide the overall structure and define the data flow, ensuring clarity and coherence in each development stage.:  </w:t>
+      </w:r>
+    </w:p>
+    <w:p>
+      <w:pPr>
+        <w:pStyle w:val="PargrafodaLista"/>
+        <w:ind w:left="586"/>
+        <w:rPr>
+          <w:rFonts w:ascii="Calibri" w:eastAsia="Calibri" w:hAnsi="Calibri" w:cs="Calibri"/>
+          <w:sz w:val="20"/>
+          <w:szCs w:val="20"/>
+        </w:rPr>
+      </w:pPr>
+    </w:p>
+    <w:p>
+      <w:pPr>
+        <w:pStyle w:val="PargrafodaLista"/>
+        <w:numPr>
+          <w:ilvl w:val="0"/>
+          <w:numId w:val="4"/>
+        </w:numPr>
+        <w:rPr>
+          <w:rFonts w:ascii="Calibri" w:eastAsia="Calibri" w:hAnsi="Calibri" w:cs="Calibri"/>
+          <w:sz w:val="20"/>
+          <w:szCs w:val="20"/>
           <w:lang w:val="pt-BR"/>
         </w:rPr>
       </w:pPr>
@@ -1096,26 +1085,15 @@
         </w:rPr>
         <w:t xml:space="preserve">Criei dentro do Ambiente </w:t>
       </w:r>
-      <w:proofErr w:type="gramStart"/>
-      <w:r>
-        <w:rPr>
-          <w:rFonts w:ascii="Calibri" w:eastAsia="Calibri" w:hAnsi="Calibri" w:cs="Calibri"/>
-          <w:sz w:val="20"/>
-          <w:szCs w:val="20"/>
-          <w:lang w:val="pt-BR"/>
-        </w:rPr>
-        <w:t>Github</w:t>
-      </w:r>
-      <w:r>
-        <w:rPr>
-          <w:rFonts w:ascii="Calibri" w:eastAsia="Calibri" w:hAnsi="Calibri" w:cs="Calibri"/>
-          <w:sz w:val="20"/>
-          <w:szCs w:val="20"/>
-          <w:lang w:val="pt-BR"/>
-        </w:rPr>
-        <w:t xml:space="preserve">  o</w:t>
-      </w:r>
-      <w:proofErr w:type="gramEnd"/>
+      <w:r>
+        <w:rPr>
+          <w:rFonts w:ascii="Calibri" w:eastAsia="Calibri" w:hAnsi="Calibri" w:cs="Calibri"/>
+          <w:sz w:val="20"/>
+          <w:szCs w:val="20"/>
+          <w:lang w:val="pt-BR"/>
+        </w:rPr>
+        <w:t>Github o</w:t>
+      </w:r>
       <w:r>
         <w:rPr>
           <w:rFonts w:ascii="Calibri" w:eastAsia="Calibri" w:hAnsi="Calibri" w:cs="Calibri"/>
@@ -1166,6 +1144,7 @@
       <w:r>
         <w:rPr>
           <w:rFonts w:ascii="Calibri" w:eastAsia="Calibri" w:hAnsi="Calibri" w:cs="Calibri"/>
+          <w:noProof/>
           <w:sz w:val="20"/>
           <w:szCs w:val="20"/>
           <w:lang w:val="pt-BR"/>
@@ -1186,7 +1165,7 @@
                     <pic:cNvPicPr/>
                   </pic:nvPicPr>
                   <pic:blipFill>
-                    <a:blip r:embed="rId10"/>
+                    <a:blip r:embed="rId12"/>
                     <a:stretch>
                       <a:fillRect/>
                     </a:stretch>
@@ -1288,27 +1267,7 @@
           <w:szCs w:val="20"/>
           <w:lang w:val="pt-BR"/>
         </w:rPr>
-        <w:t xml:space="preserve">, porém como as tabelas estavam separadas nas abas por meus tive que criar </w:t>
-      </w:r>
-      <w:proofErr w:type="gramStart"/>
-      <w:r>
-        <w:rPr>
-          <w:rFonts w:ascii="Calibri" w:eastAsia="Calibri" w:hAnsi="Calibri" w:cs="Calibri"/>
-          <w:sz w:val="20"/>
-          <w:szCs w:val="20"/>
-          <w:lang w:val="pt-BR"/>
-        </w:rPr>
-        <w:t>um função</w:t>
-      </w:r>
-      <w:proofErr w:type="gramEnd"/>
-      <w:r>
-        <w:rPr>
-          <w:rFonts w:ascii="Calibri" w:eastAsia="Calibri" w:hAnsi="Calibri" w:cs="Calibri"/>
-          <w:sz w:val="20"/>
-          <w:szCs w:val="20"/>
-          <w:lang w:val="pt-BR"/>
-        </w:rPr>
-        <w:t xml:space="preserve"> que juntar todo </w:t>
+        <w:t xml:space="preserve">, porém como as tabelas estavam separadas nas abas por meus tive que criar um função que juntar todo </w:t>
       </w:r>
       <w:proofErr w:type="spellStart"/>
       <w:r>
@@ -1330,17 +1289,15 @@
         </w:rPr>
         <w:t xml:space="preserve"> em um único arquivo para que trabalharmos com as um </w:t>
       </w:r>
-      <w:proofErr w:type="gramStart"/>
-      <w:r>
-        <w:rPr>
-          <w:rFonts w:ascii="Calibri" w:eastAsia="Calibri" w:hAnsi="Calibri" w:cs="Calibri"/>
-          <w:sz w:val="20"/>
-          <w:szCs w:val="20"/>
-          <w:lang w:val="pt-BR"/>
-        </w:rPr>
-        <w:t>arquivo normalizada</w:t>
-      </w:r>
-      <w:proofErr w:type="gramEnd"/>
+      <w:r>
+        <w:rPr>
+          <w:rFonts w:ascii="Calibri" w:eastAsia="Calibri" w:hAnsi="Calibri" w:cs="Calibri"/>
+          <w:sz w:val="20"/>
+          <w:szCs w:val="20"/>
+          <w:lang w:val="pt-BR"/>
+        </w:rPr>
+        <w:t>arquivo normalizado</w:t>
+      </w:r>
       <w:r>
         <w:rPr>
           <w:rFonts w:ascii="Calibri" w:eastAsia="Calibri" w:hAnsi="Calibri" w:cs="Calibri"/>
@@ -1373,10 +1330,12 @@
       <w:r>
         <w:rPr>
           <w:rFonts w:ascii="Calibri" w:eastAsia="Calibri" w:hAnsi="Calibri" w:cs="Calibri"/>
-          <w:sz w:val="20"/>
-          <w:szCs w:val="20"/>
-          <w:lang w:val="pt-BR"/>
-        </w:rPr>
+          <w:noProof/>
+          <w:sz w:val="20"/>
+          <w:szCs w:val="20"/>
+          <w:lang w:val="pt-BR"/>
+        </w:rPr>
+        <w:lastRenderedPageBreak/>
         <w:drawing>
           <wp:inline distT="0" distB="0" distL="0" distR="0" wp14:anchorId="5D34EE3E" wp14:editId="291888B3">
             <wp:extent cx="4258241" cy="2225954"/>
@@ -1393,7 +1352,7 @@
                     <pic:cNvPicPr/>
                   </pic:nvPicPr>
                   <pic:blipFill>
-                    <a:blip r:embed="rId11"/>
+                    <a:blip r:embed="rId13"/>
                     <a:stretch>
                       <a:fillRect/>
                     </a:stretch>
@@ -1450,6 +1409,7 @@
       <w:r>
         <w:rPr>
           <w:rFonts w:ascii="Calibri" w:eastAsia="Calibri" w:hAnsi="Calibri" w:cs="Calibri"/>
+          <w:noProof/>
           <w:sz w:val="20"/>
           <w:szCs w:val="20"/>
           <w:lang w:val="pt-BR"/>
@@ -1470,7 +1430,7 @@
                     <pic:cNvPicPr/>
                   </pic:nvPicPr>
                   <pic:blipFill>
-                    <a:blip r:embed="rId12"/>
+                    <a:blip r:embed="rId14"/>
                     <a:stretch>
                       <a:fillRect/>
                     </a:stretch>
@@ -1491,6 +1451,736 @@
         </w:drawing>
       </w:r>
     </w:p>
+    <w:p>
+      <w:pPr>
+        <w:pStyle w:val="PargrafodaLista"/>
+        <w:ind w:left="586"/>
+        <w:rPr>
+          <w:rFonts w:ascii="Calibri" w:eastAsia="Calibri" w:hAnsi="Calibri" w:cs="Calibri"/>
+          <w:sz w:val="20"/>
+          <w:szCs w:val="20"/>
+          <w:lang w:val="pt-BR"/>
+        </w:rPr>
+      </w:pPr>
+    </w:p>
+    <w:p>
+      <w:pPr>
+        <w:pStyle w:val="PargrafodaLista"/>
+        <w:numPr>
+          <w:ilvl w:val="0"/>
+          <w:numId w:val="4"/>
+        </w:numPr>
+        <w:rPr>
+          <w:rFonts w:ascii="Calibri" w:eastAsia="Calibri" w:hAnsi="Calibri" w:cs="Calibri"/>
+          <w:sz w:val="20"/>
+          <w:szCs w:val="20"/>
+          <w:lang w:val="pt-BR"/>
+        </w:rPr>
+      </w:pPr>
+      <w:r>
+        <w:rPr>
+          <w:rFonts w:ascii="Calibri" w:eastAsia="Calibri" w:hAnsi="Calibri" w:cs="Calibri"/>
+          <w:sz w:val="20"/>
+          <w:szCs w:val="20"/>
+          <w:lang w:val="pt-BR"/>
+        </w:rPr>
+        <w:t>Normalizar os valores da planilha que será essencial para a predição</w:t>
+      </w:r>
+    </w:p>
+    <w:p>
+      <w:pPr>
+        <w:rPr>
+          <w:rFonts w:ascii="Calibri" w:eastAsia="Calibri" w:hAnsi="Calibri" w:cs="Calibri"/>
+          <w:sz w:val="20"/>
+          <w:szCs w:val="20"/>
+          <w:lang w:val="pt-BR"/>
+        </w:rPr>
+      </w:pPr>
+      <w:r>
+        <w:rPr>
+          <w:rFonts w:ascii="Calibri" w:eastAsia="Calibri" w:hAnsi="Calibri" w:cs="Calibri"/>
+          <w:sz w:val="20"/>
+          <w:szCs w:val="20"/>
+          <w:lang w:val="pt-BR"/>
+        </w:rPr>
+        <w:tab/>
+      </w:r>
+      <w:r>
+        <w:rPr>
+          <w:rFonts w:ascii="Calibri" w:eastAsia="Calibri" w:hAnsi="Calibri" w:cs="Calibri"/>
+          <w:sz w:val="20"/>
+          <w:szCs w:val="20"/>
+          <w:lang w:val="pt-BR"/>
+        </w:rPr>
+        <w:drawing>
+          <wp:inline distT="0" distB="0" distL="0" distR="0" wp14:anchorId="19F0AE30" wp14:editId="7C950E27">
+            <wp:extent cx="4054827" cy="1081313"/>
+            <wp:effectExtent l="0" t="0" r="3175" b="5080"/>
+            <wp:docPr id="1503488830" name="Imagem 1" descr="Texto"/>
+            <wp:cNvGraphicFramePr>
+              <a:graphicFrameLocks xmlns:a="http://schemas.openxmlformats.org/drawingml/2006/main" noChangeAspect="1"/>
+            </wp:cNvGraphicFramePr>
+            <a:graphic xmlns:a="http://schemas.openxmlformats.org/drawingml/2006/main">
+              <a:graphicData uri="http://schemas.openxmlformats.org/drawingml/2006/picture">
+                <pic:pic xmlns:pic="http://schemas.openxmlformats.org/drawingml/2006/picture">
+                  <pic:nvPicPr>
+                    <pic:cNvPr id="1503488830" name="Imagem 1" descr="Texto"/>
+                    <pic:cNvPicPr/>
+                  </pic:nvPicPr>
+                  <pic:blipFill>
+                    <a:blip r:embed="rId15"/>
+                    <a:stretch>
+                      <a:fillRect/>
+                    </a:stretch>
+                  </pic:blipFill>
+                  <pic:spPr>
+                    <a:xfrm>
+                      <a:off x="0" y="0"/>
+                      <a:ext cx="4089043" cy="1090438"/>
+                    </a:xfrm>
+                    <a:prstGeom prst="rect">
+                      <a:avLst/>
+                    </a:prstGeom>
+                  </pic:spPr>
+                </pic:pic>
+              </a:graphicData>
+            </a:graphic>
+          </wp:inline>
+        </w:drawing>
+      </w:r>
+    </w:p>
+    <w:p>
+      <w:pPr>
+        <w:rPr>
+          <w:rFonts w:ascii="Calibri" w:eastAsia="Calibri" w:hAnsi="Calibri" w:cs="Calibri"/>
+          <w:sz w:val="20"/>
+          <w:szCs w:val="20"/>
+          <w:lang w:val="pt-BR"/>
+        </w:rPr>
+      </w:pPr>
+    </w:p>
+    <w:p>
+      <w:pPr>
+        <w:pStyle w:val="PargrafodaLista"/>
+        <w:numPr>
+          <w:ilvl w:val="0"/>
+          <w:numId w:val="4"/>
+        </w:numPr>
+        <w:rPr>
+          <w:rFonts w:ascii="Calibri" w:eastAsia="Calibri" w:hAnsi="Calibri" w:cs="Calibri"/>
+          <w:sz w:val="20"/>
+          <w:szCs w:val="20"/>
+          <w:lang w:val="pt-BR"/>
+        </w:rPr>
+      </w:pPr>
+      <w:r>
+        <w:rPr>
+          <w:rFonts w:ascii="Calibri" w:eastAsia="Calibri" w:hAnsi="Calibri" w:cs="Calibri"/>
+          <w:sz w:val="20"/>
+          <w:szCs w:val="20"/>
+          <w:lang w:val="pt-BR"/>
+        </w:rPr>
+        <w:t xml:space="preserve">Limpar dados que estejam com espaço vazio que possa da interferência no nosso modelo de Machine </w:t>
+      </w:r>
+      <w:proofErr w:type="spellStart"/>
+      <w:r>
+        <w:rPr>
+          <w:rFonts w:ascii="Calibri" w:eastAsia="Calibri" w:hAnsi="Calibri" w:cs="Calibri"/>
+          <w:sz w:val="20"/>
+          <w:szCs w:val="20"/>
+          <w:lang w:val="pt-BR"/>
+        </w:rPr>
+        <w:t>Lerning</w:t>
+      </w:r>
+      <w:proofErr w:type="spellEnd"/>
+      <w:r>
+        <w:rPr>
+          <w:rFonts w:ascii="Calibri" w:eastAsia="Calibri" w:hAnsi="Calibri" w:cs="Calibri"/>
+          <w:sz w:val="20"/>
+          <w:szCs w:val="20"/>
+          <w:lang w:val="pt-BR"/>
+        </w:rPr>
+        <w:t xml:space="preserve"> de Predição. </w:t>
+      </w:r>
+    </w:p>
+    <w:p>
+      <w:pPr>
+        <w:ind w:left="226"/>
+        <w:rPr>
+          <w:rFonts w:ascii="Calibri" w:eastAsia="Calibri" w:hAnsi="Calibri" w:cs="Calibri"/>
+          <w:sz w:val="20"/>
+          <w:szCs w:val="20"/>
+          <w:lang w:val="pt-BR"/>
+        </w:rPr>
+      </w:pPr>
+    </w:p>
+    <w:p>
+      <w:pPr>
+        <w:ind w:left="420"/>
+        <w:rPr>
+          <w:rFonts w:ascii="Calibri" w:eastAsia="Calibri" w:hAnsi="Calibri" w:cs="Calibri"/>
+          <w:sz w:val="20"/>
+          <w:szCs w:val="20"/>
+          <w:lang w:val="pt-BR"/>
+        </w:rPr>
+      </w:pPr>
+      <w:r>
+        <w:rPr>
+          <w:rFonts w:ascii="Calibri" w:eastAsia="Calibri" w:hAnsi="Calibri" w:cs="Calibri"/>
+          <w:noProof/>
+          <w:sz w:val="20"/>
+          <w:szCs w:val="20"/>
+          <w:lang w:val="pt-BR"/>
+        </w:rPr>
+        <w:lastRenderedPageBreak/>
+        <w:drawing>
+          <wp:inline distT="0" distB="0" distL="0" distR="0" wp14:anchorId="2CFB6407" wp14:editId="229D6079">
+            <wp:extent cx="3550541" cy="2460204"/>
+            <wp:effectExtent l="0" t="0" r="0" b="0"/>
+            <wp:docPr id="1103127387" name="Imagem 2"/>
+            <wp:cNvGraphicFramePr>
+              <a:graphicFrameLocks xmlns:a="http://schemas.openxmlformats.org/drawingml/2006/main" noChangeAspect="1"/>
+            </wp:cNvGraphicFramePr>
+            <a:graphic xmlns:a="http://schemas.openxmlformats.org/drawingml/2006/main">
+              <a:graphicData uri="http://schemas.openxmlformats.org/drawingml/2006/picture">
+                <pic:pic xmlns:pic="http://schemas.openxmlformats.org/drawingml/2006/picture">
+                  <pic:nvPicPr>
+                    <pic:cNvPr id="0" name="Picture 3"/>
+                    <pic:cNvPicPr>
+                      <a:picLocks noChangeAspect="1" noChangeArrowheads="1"/>
+                    </pic:cNvPicPr>
+                  </pic:nvPicPr>
+                  <pic:blipFill>
+                    <a:blip r:embed="rId16" cstate="print">
+                      <a:extLst>
+                        <a:ext uri="{28A0092B-C50C-407E-A947-70E740481C1C}">
+                          <a14:useLocalDpi xmlns:a14="http://schemas.microsoft.com/office/drawing/2010/main" val="0"/>
+                        </a:ext>
+                      </a:extLst>
+                    </a:blip>
+                    <a:srcRect/>
+                    <a:stretch>
+                      <a:fillRect/>
+                    </a:stretch>
+                  </pic:blipFill>
+                  <pic:spPr bwMode="auto">
+                    <a:xfrm>
+                      <a:off x="0" y="0"/>
+                      <a:ext cx="3594629" cy="2490753"/>
+                    </a:xfrm>
+                    <a:prstGeom prst="rect">
+                      <a:avLst/>
+                    </a:prstGeom>
+                    <a:noFill/>
+                  </pic:spPr>
+                </pic:pic>
+              </a:graphicData>
+            </a:graphic>
+          </wp:inline>
+        </w:drawing>
+      </w:r>
+    </w:p>
+    <w:p>
+      <w:pPr>
+        <w:rPr>
+          <w:rFonts w:ascii="Calibri" w:eastAsia="Calibri" w:hAnsi="Calibri" w:cs="Calibri"/>
+          <w:sz w:val="20"/>
+          <w:szCs w:val="20"/>
+          <w:lang w:val="pt-BR"/>
+        </w:rPr>
+      </w:pPr>
+    </w:p>
+    <w:p>
+      <w:pPr>
+        <w:rPr>
+          <w:rFonts w:ascii="Calibri" w:eastAsia="Calibri" w:hAnsi="Calibri" w:cs="Calibri"/>
+          <w:sz w:val="20"/>
+          <w:szCs w:val="20"/>
+          <w:lang w:val="pt-BR"/>
+        </w:rPr>
+      </w:pPr>
+    </w:p>
+    <w:p>
+      <w:pPr>
+        <w:rPr>
+          <w:rFonts w:ascii="Calibri" w:eastAsia="Calibri" w:hAnsi="Calibri" w:cs="Calibri"/>
+          <w:sz w:val="20"/>
+          <w:szCs w:val="20"/>
+          <w:lang w:val="pt-BR"/>
+        </w:rPr>
+      </w:pPr>
+    </w:p>
+    <w:p>
+      <w:pPr>
+        <w:rPr>
+          <w:rFonts w:ascii="Calibri" w:eastAsia="Calibri" w:hAnsi="Calibri" w:cs="Calibri"/>
+          <w:sz w:val="20"/>
+          <w:szCs w:val="20"/>
+          <w:lang w:val="pt-BR"/>
+        </w:rPr>
+      </w:pPr>
+      <w:r>
+        <w:rPr>
+          <w:rFonts w:ascii="Calibri" w:eastAsia="Calibri" w:hAnsi="Calibri" w:cs="Calibri"/>
+          <w:sz w:val="20"/>
+          <w:szCs w:val="20"/>
+          <w:lang w:val="pt-BR"/>
+        </w:rPr>
+        <w:t xml:space="preserve">Dados limpos: </w:t>
+      </w:r>
+    </w:p>
+    <w:p>
+      <w:pPr>
+        <w:rPr>
+          <w:rFonts w:ascii="Calibri" w:eastAsia="Calibri" w:hAnsi="Calibri" w:cs="Calibri"/>
+          <w:sz w:val="20"/>
+          <w:szCs w:val="20"/>
+          <w:lang w:val="pt-BR"/>
+        </w:rPr>
+      </w:pPr>
+      <w:r>
+        <w:rPr>
+          <w:rFonts w:ascii="Calibri" w:eastAsia="Calibri" w:hAnsi="Calibri" w:cs="Calibri"/>
+          <w:sz w:val="20"/>
+          <w:szCs w:val="20"/>
+          <w:lang w:val="pt-BR"/>
+        </w:rPr>
+        <w:drawing>
+          <wp:inline distT="0" distB="0" distL="0" distR="0" wp14:anchorId="0E3E1AF0" wp14:editId="58112B6E">
+            <wp:extent cx="3054720" cy="3104630"/>
+            <wp:effectExtent l="0" t="0" r="0" b="635"/>
+            <wp:docPr id="950419772" name="Imagem 1" descr="Texto&#10;&#10;O conteúdo gerado por IA pode estar incorreto."/>
+            <wp:cNvGraphicFramePr>
+              <a:graphicFrameLocks xmlns:a="http://schemas.openxmlformats.org/drawingml/2006/main" noChangeAspect="1"/>
+            </wp:cNvGraphicFramePr>
+            <a:graphic xmlns:a="http://schemas.openxmlformats.org/drawingml/2006/main">
+              <a:graphicData uri="http://schemas.openxmlformats.org/drawingml/2006/picture">
+                <pic:pic xmlns:pic="http://schemas.openxmlformats.org/drawingml/2006/picture">
+                  <pic:nvPicPr>
+                    <pic:cNvPr id="950419772" name="Imagem 1" descr="Texto&#10;&#10;O conteúdo gerado por IA pode estar incorreto."/>
+                    <pic:cNvPicPr/>
+                  </pic:nvPicPr>
+                  <pic:blipFill>
+                    <a:blip r:embed="rId17"/>
+                    <a:stretch>
+                      <a:fillRect/>
+                    </a:stretch>
+                  </pic:blipFill>
+                  <pic:spPr>
+                    <a:xfrm>
+                      <a:off x="0" y="0"/>
+                      <a:ext cx="3073351" cy="3123566"/>
+                    </a:xfrm>
+                    <a:prstGeom prst="rect">
+                      <a:avLst/>
+                    </a:prstGeom>
+                  </pic:spPr>
+                </pic:pic>
+              </a:graphicData>
+            </a:graphic>
+          </wp:inline>
+        </w:drawing>
+      </w:r>
+      <w:r>
+        <w:rPr>
+          <w:rFonts w:ascii="Calibri" w:eastAsia="Calibri" w:hAnsi="Calibri" w:cs="Calibri"/>
+          <w:sz w:val="20"/>
+          <w:szCs w:val="20"/>
+          <w:lang w:val="pt-BR"/>
+        </w:rPr>
+        <w:t xml:space="preserve"> </w:t>
+      </w:r>
+    </w:p>
+    <w:p>
+      <w:pPr>
+        <w:rPr>
+          <w:rFonts w:ascii="Calibri" w:eastAsia="Calibri" w:hAnsi="Calibri" w:cs="Calibri"/>
+          <w:sz w:val="20"/>
+          <w:szCs w:val="20"/>
+          <w:lang w:val="pt-BR"/>
+        </w:rPr>
+      </w:pPr>
+    </w:p>
+    <w:p>
+      <w:pPr>
+        <w:pStyle w:val="PargrafodaLista"/>
+        <w:numPr>
+          <w:ilvl w:val="0"/>
+          <w:numId w:val="4"/>
+        </w:numPr>
+        <w:rPr>
+          <w:rFonts w:ascii="Calibri" w:eastAsia="Calibri" w:hAnsi="Calibri" w:cs="Calibri"/>
+          <w:sz w:val="20"/>
+          <w:szCs w:val="20"/>
+          <w:lang w:val="pt-BR"/>
+        </w:rPr>
+      </w:pPr>
+      <w:r>
+        <w:rPr>
+          <w:rFonts w:ascii="Calibri" w:eastAsia="Calibri" w:hAnsi="Calibri" w:cs="Calibri"/>
+          <w:sz w:val="20"/>
+          <w:szCs w:val="20"/>
+          <w:lang w:val="pt-BR"/>
+        </w:rPr>
+        <w:t xml:space="preserve">Consolidar o fluxo de caixa criamos algumas colunas e parâmetros para fazer toda a parte de consolidação: </w:t>
+      </w:r>
+    </w:p>
+    <w:p>
+      <w:pPr>
+        <w:pStyle w:val="PargrafodaLista"/>
+        <w:ind w:left="586"/>
+        <w:rPr>
+          <w:rFonts w:ascii="Calibri" w:eastAsia="Calibri" w:hAnsi="Calibri" w:cs="Calibri"/>
+          <w:sz w:val="20"/>
+          <w:szCs w:val="20"/>
+          <w:lang w:val="pt-BR"/>
+        </w:rPr>
+      </w:pPr>
+      <w:r>
+        <w:rPr>
+          <w:rFonts w:ascii="Calibri" w:eastAsia="Calibri" w:hAnsi="Calibri" w:cs="Calibri"/>
+          <w:sz w:val="20"/>
+          <w:szCs w:val="20"/>
+          <w:lang w:val="pt-BR"/>
+        </w:rPr>
+        <w:t xml:space="preserve">Criamos variação mensal, despesa acumulada, lucro acumulado, margem de lucros nos campos, valor, tipo e mês ano </w:t>
+      </w:r>
+      <w:r>
+        <w:rPr>
+          <w:rFonts w:ascii="Calibri" w:eastAsia="Calibri" w:hAnsi="Calibri" w:cs="Calibri"/>
+          <w:sz w:val="20"/>
+          <w:szCs w:val="20"/>
+          <w:lang w:val="pt-BR"/>
+        </w:rPr>
+        <w:t>ignora</w:t>
+      </w:r>
+      <w:r>
+        <w:rPr>
+          <w:rFonts w:ascii="Calibri" w:eastAsia="Calibri" w:hAnsi="Calibri" w:cs="Calibri"/>
+          <w:sz w:val="20"/>
+          <w:szCs w:val="20"/>
+          <w:lang w:val="pt-BR"/>
+        </w:rPr>
+        <w:t xml:space="preserve"> os valores vazio e colocar as despesas como </w:t>
+      </w:r>
+      <w:proofErr w:type="spellStart"/>
+      <w:r>
+        <w:rPr>
+          <w:rFonts w:ascii="Calibri" w:eastAsia="Calibri" w:hAnsi="Calibri" w:cs="Calibri"/>
+          <w:sz w:val="20"/>
+          <w:szCs w:val="20"/>
+          <w:lang w:val="pt-BR"/>
+        </w:rPr>
+        <w:t>float</w:t>
+      </w:r>
+      <w:proofErr w:type="spellEnd"/>
+      <w:r>
+        <w:rPr>
+          <w:rFonts w:ascii="Calibri" w:eastAsia="Calibri" w:hAnsi="Calibri" w:cs="Calibri"/>
+          <w:sz w:val="20"/>
+          <w:szCs w:val="20"/>
+          <w:lang w:val="pt-BR"/>
+        </w:rPr>
+        <w:t xml:space="preserve"> </w:t>
+      </w:r>
+    </w:p>
+    <w:p>
+      <w:pPr>
+        <w:rPr>
+          <w:rFonts w:ascii="Calibri" w:eastAsia="Calibri" w:hAnsi="Calibri" w:cs="Calibri"/>
+          <w:sz w:val="20"/>
+          <w:szCs w:val="20"/>
+          <w:lang w:val="pt-BR"/>
+        </w:rPr>
+      </w:pPr>
+      <w:r>
+        <w:rPr>
+          <w:rFonts w:ascii="Calibri" w:eastAsia="Calibri" w:hAnsi="Calibri" w:cs="Calibri"/>
+          <w:sz w:val="20"/>
+          <w:szCs w:val="20"/>
+          <w:lang w:val="pt-BR"/>
+        </w:rPr>
+        <w:lastRenderedPageBreak/>
+        <w:t xml:space="preserve">  </w:t>
+      </w:r>
+      <w:r>
+        <w:rPr>
+          <w:rFonts w:ascii="Calibri" w:eastAsia="Calibri" w:hAnsi="Calibri" w:cs="Calibri"/>
+          <w:noProof/>
+          <w:sz w:val="20"/>
+          <w:szCs w:val="20"/>
+          <w:lang w:val="pt-BR"/>
+        </w:rPr>
+        <w:drawing>
+          <wp:inline distT="0" distB="0" distL="0" distR="0" wp14:anchorId="6DBE4D1C" wp14:editId="5EBA0D4E">
+            <wp:extent cx="4615262" cy="3622618"/>
+            <wp:effectExtent l="0" t="0" r="0" b="0"/>
+            <wp:docPr id="1736937820" name="Imagem 3"/>
+            <wp:cNvGraphicFramePr>
+              <a:graphicFrameLocks xmlns:a="http://schemas.openxmlformats.org/drawingml/2006/main" noChangeAspect="1"/>
+            </wp:cNvGraphicFramePr>
+            <a:graphic xmlns:a="http://schemas.openxmlformats.org/drawingml/2006/main">
+              <a:graphicData uri="http://schemas.openxmlformats.org/drawingml/2006/picture">
+                <pic:pic xmlns:pic="http://schemas.openxmlformats.org/drawingml/2006/picture">
+                  <pic:nvPicPr>
+                    <pic:cNvPr id="0" name="Picture 4"/>
+                    <pic:cNvPicPr>
+                      <a:picLocks noChangeAspect="1" noChangeArrowheads="1"/>
+                    </pic:cNvPicPr>
+                  </pic:nvPicPr>
+                  <pic:blipFill>
+                    <a:blip r:embed="rId18" cstate="print">
+                      <a:extLst>
+                        <a:ext uri="{28A0092B-C50C-407E-A947-70E740481C1C}">
+                          <a14:useLocalDpi xmlns:a14="http://schemas.microsoft.com/office/drawing/2010/main" val="0"/>
+                        </a:ext>
+                      </a:extLst>
+                    </a:blip>
+                    <a:srcRect/>
+                    <a:stretch>
+                      <a:fillRect/>
+                    </a:stretch>
+                  </pic:blipFill>
+                  <pic:spPr bwMode="auto">
+                    <a:xfrm>
+                      <a:off x="0" y="0"/>
+                      <a:ext cx="4666536" cy="3662864"/>
+                    </a:xfrm>
+                    <a:prstGeom prst="rect">
+                      <a:avLst/>
+                    </a:prstGeom>
+                    <a:noFill/>
+                  </pic:spPr>
+                </pic:pic>
+              </a:graphicData>
+            </a:graphic>
+          </wp:inline>
+        </w:drawing>
+      </w:r>
+    </w:p>
+    <w:p>
+      <w:pPr>
+        <w:rPr>
+          <w:rFonts w:ascii="Calibri" w:eastAsia="Calibri" w:hAnsi="Calibri" w:cs="Calibri"/>
+          <w:sz w:val="20"/>
+          <w:szCs w:val="20"/>
+          <w:lang w:val="pt-BR"/>
+        </w:rPr>
+      </w:pPr>
+    </w:p>
+    <w:p>
+      <w:pPr>
+        <w:pStyle w:val="PargrafodaLista"/>
+        <w:numPr>
+          <w:ilvl w:val="0"/>
+          <w:numId w:val="4"/>
+        </w:numPr>
+        <w:rPr>
+          <w:rFonts w:ascii="Calibri" w:eastAsia="Calibri" w:hAnsi="Calibri" w:cs="Calibri"/>
+          <w:sz w:val="20"/>
+          <w:szCs w:val="20"/>
+          <w:lang w:val="pt-BR"/>
+        </w:rPr>
+      </w:pPr>
+      <w:r>
+        <w:rPr>
+          <w:rFonts w:ascii="Calibri" w:eastAsia="Calibri" w:hAnsi="Calibri" w:cs="Calibri"/>
+          <w:sz w:val="20"/>
+          <w:szCs w:val="20"/>
+          <w:lang w:val="pt-BR"/>
+        </w:rPr>
+        <w:t>Criar uma visualização estruturada dos dados financeiros contidos em uma planilha Excel, após limpá-los e consolidar o fluxo de caixa</w:t>
+      </w:r>
+      <w:r>
+        <w:rPr>
+          <w:rFonts w:ascii="Calibri" w:eastAsia="Calibri" w:hAnsi="Calibri" w:cs="Calibri"/>
+          <w:sz w:val="20"/>
+          <w:szCs w:val="20"/>
+          <w:lang w:val="pt-BR"/>
+        </w:rPr>
+        <w:t xml:space="preserve">s </w:t>
+      </w:r>
+    </w:p>
+    <w:p>
+      <w:pPr>
+        <w:rPr>
+          <w:rFonts w:ascii="Calibri" w:eastAsia="Calibri" w:hAnsi="Calibri" w:cs="Calibri"/>
+          <w:sz w:val="20"/>
+          <w:szCs w:val="20"/>
+          <w:lang w:val="pt-BR"/>
+        </w:rPr>
+      </w:pPr>
+    </w:p>
+    <w:p>
+      <w:pPr>
+        <w:ind w:left="226"/>
+        <w:rPr>
+          <w:rFonts w:ascii="Calibri" w:eastAsia="Calibri" w:hAnsi="Calibri" w:cs="Calibri"/>
+          <w:sz w:val="20"/>
+          <w:szCs w:val="20"/>
+          <w:lang w:val="pt-BR"/>
+        </w:rPr>
+      </w:pPr>
+      <w:r>
+        <w:rPr>
+          <w:rFonts w:ascii="Calibri" w:eastAsia="Calibri" w:hAnsi="Calibri" w:cs="Calibri"/>
+          <w:noProof/>
+          <w:sz w:val="20"/>
+          <w:szCs w:val="20"/>
+          <w:lang w:val="pt-BR"/>
+        </w:rPr>
+        <w:drawing>
+          <wp:inline distT="0" distB="0" distL="0" distR="0" wp14:anchorId="262673EF" wp14:editId="48B18EA4">
+            <wp:extent cx="5489391" cy="1068022"/>
+            <wp:effectExtent l="0" t="0" r="0" b="0"/>
+            <wp:docPr id="2147291950" name="Imagem 4"/>
+            <wp:cNvGraphicFramePr>
+              <a:graphicFrameLocks xmlns:a="http://schemas.openxmlformats.org/drawingml/2006/main" noChangeAspect="1"/>
+            </wp:cNvGraphicFramePr>
+            <a:graphic xmlns:a="http://schemas.openxmlformats.org/drawingml/2006/main">
+              <a:graphicData uri="http://schemas.openxmlformats.org/drawingml/2006/picture">
+                <pic:pic xmlns:pic="http://schemas.openxmlformats.org/drawingml/2006/picture">
+                  <pic:nvPicPr>
+                    <pic:cNvPr id="0" name="Picture 5"/>
+                    <pic:cNvPicPr>
+                      <a:picLocks noChangeAspect="1" noChangeArrowheads="1"/>
+                    </pic:cNvPicPr>
+                  </pic:nvPicPr>
+                  <pic:blipFill>
+                    <a:blip r:embed="rId19" cstate="print">
+                      <a:extLst>
+                        <a:ext uri="{28A0092B-C50C-407E-A947-70E740481C1C}">
+                          <a14:useLocalDpi xmlns:a14="http://schemas.microsoft.com/office/drawing/2010/main" val="0"/>
+                        </a:ext>
+                      </a:extLst>
+                    </a:blip>
+                    <a:srcRect/>
+                    <a:stretch>
+                      <a:fillRect/>
+                    </a:stretch>
+                  </pic:blipFill>
+                  <pic:spPr bwMode="auto">
+                    <a:xfrm>
+                      <a:off x="0" y="0"/>
+                      <a:ext cx="5588021" cy="1087212"/>
+                    </a:xfrm>
+                    <a:prstGeom prst="rect">
+                      <a:avLst/>
+                    </a:prstGeom>
+                    <a:noFill/>
+                  </pic:spPr>
+                </pic:pic>
+              </a:graphicData>
+            </a:graphic>
+          </wp:inline>
+        </w:drawing>
+      </w:r>
+    </w:p>
+    <w:p>
+      <w:pPr>
+        <w:pStyle w:val="PargrafodaLista"/>
+        <w:numPr>
+          <w:ilvl w:val="0"/>
+          <w:numId w:val="4"/>
+        </w:numPr>
+        <w:rPr>
+          <w:rFonts w:ascii="Calibri" w:eastAsia="Calibri" w:hAnsi="Calibri" w:cs="Calibri"/>
+          <w:sz w:val="20"/>
+          <w:szCs w:val="20"/>
+          <w:lang w:val="pt-BR"/>
+        </w:rPr>
+      </w:pPr>
+      <w:r>
+        <w:rPr>
+          <w:rFonts w:ascii="Calibri" w:eastAsia="Calibri" w:hAnsi="Calibri" w:cs="Calibri"/>
+          <w:sz w:val="20"/>
+          <w:szCs w:val="20"/>
+          <w:lang w:val="pt-BR"/>
+        </w:rPr>
+        <w:t xml:space="preserve">Criei dos arquivos um em formato de Excel extensão XLXS e outra em CSV de fato agora podemos trabalhar na predição: </w:t>
+      </w:r>
+      <w:r>
+        <w:rPr>
+          <w:rFonts w:ascii="Calibri" w:eastAsia="Calibri" w:hAnsi="Calibri" w:cs="Calibri"/>
+          <w:sz w:val="20"/>
+          <w:szCs w:val="20"/>
+          <w:lang w:val="pt-BR"/>
+        </w:rPr>
+        <w:br/>
+      </w:r>
+      <w:r>
+        <w:rPr>
+          <w:rFonts w:ascii="Calibri" w:eastAsia="Calibri" w:hAnsi="Calibri" w:cs="Calibri"/>
+          <w:sz w:val="20"/>
+          <w:szCs w:val="20"/>
+          <w:lang w:val="pt-BR"/>
+        </w:rPr>
+        <w:br/>
+      </w:r>
+      <w:r>
+        <w:rPr>
+          <w:rFonts w:ascii="Calibri" w:eastAsia="Calibri" w:hAnsi="Calibri" w:cs="Calibri"/>
+          <w:sz w:val="20"/>
+          <w:szCs w:val="20"/>
+          <w:lang w:val="pt-BR"/>
+        </w:rPr>
+        <w:drawing>
+          <wp:inline distT="0" distB="0" distL="0" distR="0" wp14:anchorId="3D9D4F83" wp14:editId="2B61F44B">
+            <wp:extent cx="4879173" cy="831688"/>
+            <wp:effectExtent l="0" t="0" r="0" b="6985"/>
+            <wp:docPr id="1411730305" name="Imagem 1" descr="Interface gráfica do usuário, Texto&#10;&#10;O conteúdo gerado por IA pode estar incorreto."/>
+            <wp:cNvGraphicFramePr>
+              <a:graphicFrameLocks xmlns:a="http://schemas.openxmlformats.org/drawingml/2006/main" noChangeAspect="1"/>
+            </wp:cNvGraphicFramePr>
+            <a:graphic xmlns:a="http://schemas.openxmlformats.org/drawingml/2006/main">
+              <a:graphicData uri="http://schemas.openxmlformats.org/drawingml/2006/picture">
+                <pic:pic xmlns:pic="http://schemas.openxmlformats.org/drawingml/2006/picture">
+                  <pic:nvPicPr>
+                    <pic:cNvPr id="1411730305" name="Imagem 1" descr="Interface gráfica do usuário, Texto&#10;&#10;O conteúdo gerado por IA pode estar incorreto."/>
+                    <pic:cNvPicPr/>
+                  </pic:nvPicPr>
+                  <pic:blipFill>
+                    <a:blip r:embed="rId20"/>
+                    <a:stretch>
+                      <a:fillRect/>
+                    </a:stretch>
+                  </pic:blipFill>
+                  <pic:spPr>
+                    <a:xfrm>
+                      <a:off x="0" y="0"/>
+                      <a:ext cx="4923021" cy="839162"/>
+                    </a:xfrm>
+                    <a:prstGeom prst="rect">
+                      <a:avLst/>
+                    </a:prstGeom>
+                  </pic:spPr>
+                </pic:pic>
+              </a:graphicData>
+            </a:graphic>
+          </wp:inline>
+        </w:drawing>
+      </w:r>
+    </w:p>
+    <w:p>
+      <w:pPr>
+        <w:ind w:left="420"/>
+        <w:rPr>
+          <w:rFonts w:ascii="Calibri" w:eastAsia="Calibri" w:hAnsi="Calibri" w:cs="Calibri"/>
+          <w:sz w:val="20"/>
+          <w:szCs w:val="20"/>
+          <w:lang w:val="pt-BR"/>
+        </w:rPr>
+      </w:pPr>
+      <w:r>
+        <w:rPr>
+          <w:rFonts w:ascii="Calibri" w:eastAsia="Calibri" w:hAnsi="Calibri" w:cs="Calibri"/>
+          <w:sz w:val="20"/>
+          <w:szCs w:val="20"/>
+          <w:lang w:val="pt-BR"/>
+        </w:rPr>
+        <w:t xml:space="preserve"> </w:t>
+      </w:r>
+    </w:p>
     <w:sectPr>
       <w:pgSz w:w="11906" w:h="16838"/>
       <w:pgMar w:top="720" w:right="720" w:bottom="720" w:left="720" w:header="851" w:footer="992" w:gutter="0"/>
@@ -1505,6 +2195,44 @@
     </w:sectPr>
   </w:body>
 </w:document>
+</file>
+
+<file path=word/endnotes.xml><?xml version="1.0" encoding="utf-8"?>
+<w:endnotes xmlns:wpc="http://schemas.microsoft.com/office/word/2010/wordprocessingCanvas" xmlns:cx="http://schemas.microsoft.com/office/drawing/2014/chartex" xmlns:cx1="http://schemas.microsoft.com/office/drawing/2015/9/8/chartex" xmlns:cx2="http://schemas.microsoft.com/office/drawing/2015/10/21/chartex" xmlns:cx3="http://schemas.microsoft.com/office/drawing/2016/5/9/chartex" xmlns:cx4="http://schemas.microsoft.com/office/drawing/2016/5/10/chartex" xmlns:cx5="http://schemas.microsoft.com/office/drawing/2016/5/11/chartex" xmlns:cx6="http://schemas.microsoft.com/office/drawing/2016/5/12/chartex" xmlns:cx7="http://schemas.microsoft.com/office/drawing/2016/5/13/chartex" xmlns:cx8="http://schemas.microsoft.com/office/drawing/2016/5/14/chartex" xmlns:mc="http://schemas.openxmlformats.org/markup-compatibility/2006" xmlns:aink="http://schemas.microsoft.com/office/drawing/2016/ink" xmlns:am3d="http://schemas.microsoft.com/office/drawing/2017/model3d" xmlns:o="urn:schemas-microsoft-com:office:office" xmlns:oel="http://schemas.microsoft.com/office/2019/extlst" xmlns:r="http://schemas.openxmlformats.org/officeDocument/2006/relationships" xmlns:m="http://schemas.openxmlformats.org/officeDocument/2006/math" xmlns:v="urn:schemas-microsoft-com:vml" xmlns:wp14="http://schemas.microsoft.com/office/word/2010/wordprocessingDrawing" xmlns:wp="http://schemas.openxmlformats.org/drawingml/2006/wordprocessingDrawing" xmlns:w10="urn:schemas-microsoft-com:office:word" xmlns:w="http://schemas.openxmlformats.org/wordprocessingml/2006/main" xmlns:w14="http://schemas.microsoft.com/office/word/2010/wordml" xmlns:w15="http://schemas.microsoft.com/office/word/2012/wordml" xmlns:w16cex="http://schemas.microsoft.com/office/word/2018/wordml/cex" xmlns:w16cid="http://schemas.microsoft.com/office/word/2016/wordml/cid" xmlns:w16="http://schemas.microsoft.com/office/word/2018/wordml" xmlns:w16du="http://schemas.microsoft.com/office/word/2023/wordml/word16du" xmlns:w16sdtdh="http://schemas.microsoft.com/office/word/2020/wordml/sdtdatahash" xmlns:w16sdtfl="http://schemas.microsoft.com/office/word/2024/wordml/sdtformatlock" xmlns:w16se="http://schemas.microsoft.com/office/word/2015/wordml/symex" xmlns:wpg="http://schemas.microsoft.com/office/word/2010/wordprocessingGroup" xmlns:wpi="http://schemas.microsoft.com/office/word/2010/wordprocessingInk" xmlns:wne="http://schemas.microsoft.com/office/word/2006/wordml" xmlns:wps="http://schemas.microsoft.com/office/word/2010/wordprocessingShape" mc:Ignorable="w14 w15 w16se w16cid w16 w16cex w16sdtdh w16sdtfl w16du wp14">
+  <w:endnote w:type="separator" w:id="-1">
+    <w:p>
+      <w:r>
+        <w:separator/>
+      </w:r>
+    </w:p>
+  </w:endnote>
+  <w:endnote w:type="continuationSeparator" w:id="0">
+    <w:p>
+      <w:r>
+        <w:continuationSeparator/>
+      </w:r>
+    </w:p>
+  </w:endnote>
+</w:endnotes>
+</file>
+
+<file path=word/footnotes.xml><?xml version="1.0" encoding="utf-8"?>
+<w:footnotes xmlns:wpc="http://schemas.microsoft.com/office/word/2010/wordprocessingCanvas" xmlns:cx="http://schemas.microsoft.com/office/drawing/2014/chartex" xmlns:cx1="http://schemas.microsoft.com/office/drawing/2015/9/8/chartex" xmlns:cx2="http://schemas.microsoft.com/office/drawing/2015/10/21/chartex" xmlns:cx3="http://schemas.microsoft.com/office/drawing/2016/5/9/chartex" xmlns:cx4="http://schemas.microsoft.com/office/drawing/2016/5/10/chartex" xmlns:cx5="http://schemas.microsoft.com/office/drawing/2016/5/11/chartex" xmlns:cx6="http://schemas.microsoft.com/office/drawing/2016/5/12/chartex" xmlns:cx7="http://schemas.microsoft.com/office/drawing/2016/5/13/chartex" xmlns:cx8="http://schemas.microsoft.com/office/drawing/2016/5/14/chartex" xmlns:mc="http://schemas.openxmlformats.org/markup-compatibility/2006" xmlns:aink="http://schemas.microsoft.com/office/drawing/2016/ink" xmlns:am3d="http://schemas.microsoft.com/office/drawing/2017/model3d" xmlns:o="urn:schemas-microsoft-com:office:office" xmlns:oel="http://schemas.microsoft.com/office/2019/extlst" xmlns:r="http://schemas.openxmlformats.org/officeDocument/2006/relationships" xmlns:m="http://schemas.openxmlformats.org/officeDocument/2006/math" xmlns:v="urn:schemas-microsoft-com:vml" xmlns:wp14="http://schemas.microsoft.com/office/word/2010/wordprocessingDrawing" xmlns:wp="http://schemas.openxmlformats.org/drawingml/2006/wordprocessingDrawing" xmlns:w10="urn:schemas-microsoft-com:office:word" xmlns:w="http://schemas.openxmlformats.org/wordprocessingml/2006/main" xmlns:w14="http://schemas.microsoft.com/office/word/2010/wordml" xmlns:w15="http://schemas.microsoft.com/office/word/2012/wordml" xmlns:w16cex="http://schemas.microsoft.com/office/word/2018/wordml/cex" xmlns:w16cid="http://schemas.microsoft.com/office/word/2016/wordml/cid" xmlns:w16="http://schemas.microsoft.com/office/word/2018/wordml" xmlns:w16du="http://schemas.microsoft.com/office/word/2023/wordml/word16du" xmlns:w16sdtdh="http://schemas.microsoft.com/office/word/2020/wordml/sdtdatahash" xmlns:w16sdtfl="http://schemas.microsoft.com/office/word/2024/wordml/sdtformatlock" xmlns:w16se="http://schemas.microsoft.com/office/word/2015/wordml/symex" xmlns:wpg="http://schemas.microsoft.com/office/word/2010/wordprocessingGroup" xmlns:wpi="http://schemas.microsoft.com/office/word/2010/wordprocessingInk" xmlns:wne="http://schemas.microsoft.com/office/word/2006/wordml" xmlns:wps="http://schemas.microsoft.com/office/word/2010/wordprocessingShape" mc:Ignorable="w14 w15 w16se w16cid w16 w16cex w16sdtdh w16sdtfl w16du wp14">
+  <w:footnote w:type="separator" w:id="-1">
+    <w:p>
+      <w:r>
+        <w:separator/>
+      </w:r>
+    </w:p>
+  </w:footnote>
+  <w:footnote w:type="continuationSeparator" w:id="0">
+    <w:p>
+      <w:r>
+        <w:continuationSeparator/>
+      </w:r>
+    </w:p>
+  </w:footnote>
+</w:footnotes>
 </file>
 
 <file path=word/numbering.xml><?xml version="1.0" encoding="utf-8"?>
@@ -2846,6 +3574,48 @@
       <w:shd w:val="clear" w:color="auto" w:fill="E1DFDD"/>
     </w:rPr>
   </w:style>
+  <w:style w:type="paragraph" w:styleId="Cabealho">
+    <w:name w:val="header"/>
+    <w:basedOn w:val="Normal"/>
+    <w:link w:val="CabealhoChar"/>
+    <w:uiPriority w:val="99"/>
+    <w:unhideWhenUsed/>
+    <w:rsid w:val="00F54BC5"/>
+    <w:pPr>
+      <w:tabs>
+        <w:tab w:val="center" w:pos="4153"/>
+        <w:tab w:val="right" w:pos="8306"/>
+      </w:tabs>
+    </w:pPr>
+  </w:style>
+  <w:style w:type="character" w:customStyle="1" w:styleId="CabealhoChar">
+    <w:name w:val="Cabeçalho Char"/>
+    <w:basedOn w:val="Fontepargpadro"/>
+    <w:link w:val="Cabealho"/>
+    <w:uiPriority w:val="99"/>
+    <w:rsid w:val="00F54BC5"/>
+  </w:style>
+  <w:style w:type="paragraph" w:styleId="Rodap">
+    <w:name w:val="footer"/>
+    <w:basedOn w:val="Normal"/>
+    <w:link w:val="RodapChar"/>
+    <w:uiPriority w:val="99"/>
+    <w:unhideWhenUsed/>
+    <w:rsid w:val="00F54BC5"/>
+    <w:pPr>
+      <w:tabs>
+        <w:tab w:val="center" w:pos="4153"/>
+        <w:tab w:val="right" w:pos="8306"/>
+      </w:tabs>
+    </w:pPr>
+  </w:style>
+  <w:style w:type="character" w:customStyle="1" w:styleId="RodapChar">
+    <w:name w:val="Rodapé Char"/>
+    <w:basedOn w:val="Fontepargpadro"/>
+    <w:link w:val="Rodap"/>
+    <w:uiPriority w:val="99"/>
+    <w:rsid w:val="00F54BC5"/>
+  </w:style>
 </w:styles>
 </file>
 

</xml_diff>